<commit_message>
docs: reformat Week-2 plan to match A1_Week1_Plan exactly (title + role headings + bold-lead bullets; no preamble, no 'heaviest load'). Content unchanged (still adversary-verified complete). Word .docx + Word-style PDF, 2pp.
</commit_message>
<xml_diff>
--- a/A1_deliverables/A1_Week2_NextRoles.docx
+++ b/A1_deliverables/A1_Week2_NextRoles.docx
@@ -3,13 +3,10 @@
 <w:document xmlns:wpc="http://schemas.microsoft.com/office/word/2010/wordprocessingCanvas" xmlns:mo="http://schemas.microsoft.com/office/mac/office/2008/main" xmlns:mc="http://schemas.openxmlformats.org/markup-compatibility/2006" xmlns:mv="urn:schemas-microsoft-com:mac:vml" xmlns:o="urn:schemas-microsoft-com:office:office" xmlns:r="http://schemas.openxmlformats.org/officeDocument/2006/relationships" xmlns:m="http://schemas.openxmlformats.org/officeDocument/2006/math" xmlns:v="urn:schemas-microsoft-com:vml" xmlns:wp14="http://schemas.microsoft.com/office/word/2010/wordprocessingDrawing" xmlns:wp="http://schemas.openxmlformats.org/drawingml/2006/wordprocessingDrawing" xmlns:w10="urn:schemas-microsoft-com:office:word" xmlns:w="http://schemas.openxmlformats.org/wordprocessingml/2006/main" xmlns:w14="http://schemas.microsoft.com/office/word/2010/wordml" xmlns:wpg="http://schemas.microsoft.com/office/word/2010/wordprocessingGroup" xmlns:wpi="http://schemas.microsoft.com/office/word/2010/wordprocessingInk" xmlns:wne="http://schemas.microsoft.com/office/word/2006/wordml" xmlns:wps="http://schemas.microsoft.com/office/word/2010/wordprocessingShape" mc:Ignorable="w14 wp14">
   <w:body>
     <w:p>
-      <w:pPr>
-        <w:jc w:val="center"/>
-      </w:pPr>
       <w:r>
         <w:rPr>
           <w:b/>
-          <w:color w:val="1F4E8C"/>
+          <w:color w:val="1F5699"/>
           <w:sz w:val="40"/>
         </w:rPr>
         <w:t>A1 Week 2 Plan</w:t>
@@ -17,61 +14,15 @@
     </w:p>
     <w:p>
       <w:pPr>
-        <w:jc w:val="center"/>
-      </w:pPr>
-      <w:r>
-        <w:rPr>
-          <w:i/>
-          <w:sz w:val="21"/>
-        </w:rPr>
-        <w:t>General Carbon/Contracting Theory &amp; Numerical Methods — closing the gap to a Management Science submission</w:t>
-      </w:r>
-    </w:p>
-    <w:p>
-      <w:r>
-        <w:rPr>
-          <w:b/>
-        </w:rPr>
-        <w:t xml:space="preserve">Status. </w:t>
-      </w:r>
-      <w:r>
-        <w:t>Week 1 delivered the spine: the capacity-substitution channel K*R &gt; K°R, the exact net-carbon inequality (C), the distribution-free cutoffs, the closed-form thresholds (the FCL adoption threshold and the renewable-cost bounds, with the small-FCL widening), a 15/15 machine-precision audit, a 3-referee honesty pass, and a green four-role integration. An adversarial Management Science review puts us at ≈70–75% of the rigor bar. The gap is one keystone — a general-distribution, finite-optimum carbon theorem — plus robustness, a clean numerical narrative, and theory positioning.</w:t>
-      </w:r>
-    </w:p>
-    <w:p>
-      <w:r>
-        <w:rPr>
-          <w:b/>
-        </w:rPr>
-        <w:t xml:space="preserve">Scope (hard wall — A1 only). </w:t>
-      </w:r>
-      <w:r>
-        <w:t>Every task below is general theory or numerical-method work on the FCL carbon model. Out of scope: real-data calibration/magnitudes (A2); reliability, welfare, social-vs-private optimum (B1); flexibility continuum, AI, storage, multi-grid, dynamics (B2). Roles stay in their own lane.</w:t>
-      </w:r>
-    </w:p>
-    <w:p>
-      <w:pPr>
-        <w:spacing w:before="160"/>
+        <w:spacing w:before="200"/>
       </w:pPr>
       <w:r>
         <w:rPr>
           <w:b/>
-          <w:color w:val="1F4E8C"/>
+          <w:color w:val="1F5699"/>
           <w:sz w:val="26"/>
         </w:rPr>
-        <w:t>Role 1 — Optimal Contract &amp; General Carbon Theory  (lead; carries the heaviest load)</w:t>
-      </w:r>
-    </w:p>
-    <w:p>
-      <w:r>
-        <w:rPr>
-          <w:b/>
-          <w:i/>
-        </w:rPr>
-        <w:t xml:space="preserve">Mandate. </w:t>
-      </w:r>
-      <w:r>
-        <w:t>A1 mandate (1): existence + full characterization of the optimal demand-response contract under general distributions, with a necessary-and-sufficient emission-reduction condition. Turn the headline from “conditional for general F” into a proved, finite-optimum theorem — the title depends on it.</w:t>
+        <w:t>Role 1 (Optimal Contract and General Carbon Theory)</w:t>
       </w:r>
     </w:p>
     <w:p>
@@ -82,10 +33,10 @@
         <w:rPr>
           <w:b/>
         </w:rPr>
-        <w:t xml:space="preserve">Existence, uniqueness &amp; contract characterization. </w:t>
+        <w:t xml:space="preserve">Establish existence, uniqueness, and the optimal contract. </w:t>
       </w:r>
       <w:r>
-        <w:t>Prove coercivity of profit Π and a primitive condition on F (e.g. log-concave density) under which the interior capacity optimum is unique; prove (not merely assert) that the contract d*(x)=min{(K_F−x)_+, K_M} is the unique optimal dispatch in the admissible policy class via the strict R&gt;c ordering — together the full characterization, discharging the “interior optimum is assumed” gap and Condition 2 (H negative definite) from primitives.</w:t>
+        <w:t>Prove coercivity of expected profit and a primitive condition on F (e.g. a log-concave density) under which the interior capacity optimum is unique, and prove that the dispatch contract d*(x)=min{(K_F−x)_+, K_M} is the unique optimal policy via the strict R&gt;c ordering. This discharges the currently-assumed interior optimum and supplies the negative-definite-Hessian condition from primitives.</w:t>
       </w:r>
     </w:p>
     <w:p>
@@ -96,10 +47,10 @@
         <w:rPr>
           <w:b/>
         </w:rPr>
-        <w:t xml:space="preserve">Primitive shift-ratio condition. </w:t>
+        <w:t xml:space="preserve">Promote the shift-ratio condition to a primitive. </w:t>
       </w:r>
       <w:r>
-        <w:t>Replace the endogenous-window “g(x)=F_{K_R}/f non-increasing” with a support-wide condition on F that implies it, and prove the implication.</w:t>
+        <w:t>Replace the endogenous-window condition g(x)=F_{K_R}/f non-increasing with a support-wide condition on F that implies it, and prove the implication.</w:t>
       </w:r>
     </w:p>
     <w:p>
@@ -110,10 +61,10 @@
         <w:rPr>
           <w:b/>
         </w:rPr>
-        <w:t xml:space="preserve">Necessary-and-sufficient emission condition, general F (keystone). </w:t>
+        <w:t xml:space="preserve">Prove the necessary-and-sufficient emission condition for general F. </w:t>
       </w:r>
       <w:r>
-        <w:t>Under that primitive plus a tail/skew condition, prove a sharp iff for carbon reduction at a finite interior optimum for any such F — upgrading condition (C) from an endogenous inequality and the current existence conjecture to a clean necessary-and-sufficient theorem in primitives. Exhibit a non-power-law F satisfying all three primitive conditions (log-concavity, shift-ratio, tail/skew) to certify the admissible class is non-vacuous and genuinely more general than power-law/uniform.</w:t>
+        <w:t>Under that primitive plus a tail/skew condition, prove a sharp iff for carbon reduction at a finite interior optimum, upgrading the endogenous inequality (C) and the current existence conjecture to a clean condition in primitives. Exhibit a non-power-law F satisfying all three conditions to certify the class is non-vacuous and genuinely more general than the power-law/uniform case.</w:t>
       </w:r>
     </w:p>
     <w:p>
@@ -127,7 +78,7 @@
         <w:t xml:space="preserve">Complete the viability threshold. </w:t>
       </w:r>
       <w:r>
-        <w:t>Extend the C_R† window from the power-law family to general F (the strict fall occurs at a finite, interior K*R, not the K*R=∞ corner), and prove Δ(C_R) is single-crossing so {Δ≥0}=(C_R°, C_R†] is a genuine interval — i.e. carbon falls iff C_R &lt; C_R†.</w:t>
+        <w:t>Extend the renewable-cost window from the power-law family to general F, with the strict fall at a finite interior K_R* rather than the unbounded corner, and prove the carbon-reduction set is an interval (single-crossing in C_R) so carbon falls if and only if C_R is below the threshold.</w:t>
       </w:r>
     </w:p>
     <w:p>
@@ -138,35 +89,23 @@
         <w:rPr>
           <w:b/>
         </w:rPr>
-        <w:t xml:space="preserve">Main theorem + re-scope. </w:t>
+        <w:t xml:space="preserve">State the main theorem and re-scope. </w:t>
       </w:r>
       <w:r>
-        <w:t>State the headline theorem, align the abstract/title to exactly what is proved, and write the economic intuition at journal quality.</w:t>
+        <w:t>State the headline theorem, align the abstract and title to exactly what is proved, and write the economic intuition at journal quality.</w:t>
       </w:r>
     </w:p>
     <w:p>
       <w:pPr>
-        <w:spacing w:before="160"/>
+        <w:spacing w:before="200"/>
       </w:pPr>
       <w:r>
         <w:rPr>
           <w:b/>
-          <w:color w:val="1F4E8C"/>
+          <w:color w:val="1F5699"/>
           <w:sz w:val="26"/>
         </w:rPr>
-        <w:t>Role 2 — Solver &amp; Numerical Methods</w:t>
-      </w:r>
-    </w:p>
-    <w:p>
-      <w:r>
-        <w:rPr>
-          <w:b/>
-          <w:i/>
-        </w:rPr>
-        <w:t xml:space="preserve">Mandate. </w:t>
-      </w:r>
-      <w:r>
-        <w:t>A1 mandate (4): build and document the numerical solver for d*(x) and k* the group relies on; deliver one coherent, reproducible backbone demonstrating the theory at a finite interior optimum.</w:t>
+        <w:t>Role 2 (Solver and Numerical Methods)</w:t>
       </w:r>
     </w:p>
     <w:p>
@@ -177,10 +116,10 @@
         <w:rPr>
           <w:b/>
         </w:rPr>
-        <w:t xml:space="preserve">General solver for d*(x) and k*. </w:t>
+        <w:t xml:space="preserve">Build and document the general solver. </w:t>
       </w:r>
       <w:r>
-        <w:t>Finalize and document the joint-capacity / dispatch solver for any residual-demand distribution — the validated backend every role builds on.</w:t>
+        <w:t>Finalize the joint-capacity and dispatch solver for d*(x) and the capacities under any residual-demand distribution — the validated backend the rest of the group relies on.</w:t>
       </w:r>
     </w:p>
     <w:p>
@@ -191,10 +130,10 @@
         <w:rPr>
           <w:b/>
         </w:rPr>
-        <w:t xml:space="preserve">One carbon-sign narrative. </w:t>
+        <w:t xml:space="preserve">Deliver one carbon-sign narrative. </w:t>
       </w:r>
       <w:r>
-        <w:t>Replace the scattered “2/32” counts with a principled sweep over Role 1’s primitive condition on a curated family, showing carbon falls at a finite interior optimum.</w:t>
+        <w:t>Replace the scattered counts with a principled sweep over Role 1's primitive condition on a curated distribution family, showing carbon falls at a finite interior optimum.</w:t>
       </w:r>
     </w:p>
     <w:p>
@@ -205,10 +144,10 @@
         <w:rPr>
           <w:b/>
         </w:rPr>
-        <w:t xml:space="preserve">Hessian / existence certificate. </w:t>
+        <w:t xml:space="preserve">Provide a Hessian / existence certificate. </w:t>
       </w:r>
       <w:r>
-        <w:t>A reproducible check that the Hessian H is negative definite on the interior path for Role 1’s distribution class (backstops existence &amp; uniqueness).</w:t>
+        <w:t>A reproducible check that the Hessian is negative definite on the interior path for Role 1's distribution class, backstopping existence and uniqueness.</w:t>
       </w:r>
     </w:p>
     <w:p>
@@ -219,35 +158,23 @@
         <w:rPr>
           <w:b/>
         </w:rPr>
-        <w:t xml:space="preserve">Analytic-cofactor solver + one-command reproducibility. </w:t>
+        <w:t xml:space="preserve">Harden the solver and ship reproducibility. </w:t>
       </w:r>
       <w:r>
-        <w:t>Replace finite-difference cofactors with analytic ones (removes the noisy knife-edge points); ship a single reproduce harness covering the 15 exact-formula checks plus the carbon sweep, with documented tolerances.</w:t>
+        <w:t>Replace finite-difference cofactors with analytic ones to remove the noisy knife-edge points, and ship a single command that reproduces the exact-formula checks and the carbon sweep, with documented tolerances.</w:t>
       </w:r>
     </w:p>
     <w:p>
       <w:pPr>
-        <w:spacing w:before="160"/>
+        <w:spacing w:before="200"/>
       </w:pPr>
       <w:r>
         <w:rPr>
           <w:b/>
-          <w:color w:val="1F4E8C"/>
+          <w:color w:val="1F5699"/>
           <w:sz w:val="26"/>
         </w:rPr>
-        <w:t>Role 3 — Comparative Statics &amp; Robustness</w:t>
-      </w:r>
-    </w:p>
-    <w:p>
-      <w:r>
-        <w:rPr>
-          <w:b/>
-          <w:i/>
-        </w:rPr>
-        <w:t xml:space="preserve">Mandate. </w:t>
-      </w:r>
-      <w:r>
-        <w:t>A1 mandate (2): prove, under general conditions, the correlation comparative static and that mining raises optimal renewable capacity; close the cross-distribution robustness layer and deliver the sharpness example.</w:t>
+        <w:t>Role 3 (Comparative Statics and Robustness)</w:t>
       </w:r>
     </w:p>
     <w:p>
@@ -258,10 +185,10 @@
         <w:rPr>
           <w:b/>
         </w:rPr>
-        <w:t xml:space="preserve">Correlation &amp; price comparative statics (general). </w:t>
+        <w:t xml:space="preserve">Prove the correlation and price comparative statics. </w:t>
       </w:r>
       <w:r>
-        <w:t>Prove the net-carbon sign is governed by the demand–supply association (the shift ratio g = E[S|x]); that mining raises optimal renewable capacity K*R &gt; K°R (A1 mandate 2); and sign the monotonicities in the model’s key prices — ∂(carbon effect)/∂R (computing margin), ∂/∂β (blackout penalty), ∂/∂p (retail price) — which a theory referee always asks for and no Week-1 result covers.</w:t>
+        <w:t>Show the net-carbon sign is governed by the demand–supply association (the shift ratio g = E[S | x]); that mining raises optimal renewable capacity K_R* &gt; K_R°; and sign the monotonicities in the computing margin R, the blackout penalty β, and the retail price p, under general conditions.</w:t>
       </w:r>
     </w:p>
     <w:p>
@@ -272,10 +199,10 @@
         <w:rPr>
           <w:b/>
         </w:rPr>
-        <w:t xml:space="preserve">Cross-F least-favorable &amp; robust certificate. </w:t>
+        <w:t xml:space="preserve">Establish the cross-distribution robust certificate. </w:t>
       </w:r>
       <w:r>
-        <w:t>Sign the capacity covariation dK*/dF along the shape class U so the least-favorable result holds across F, making C_R ≤ C†R ⇒ Δ ≥ 0 a genuine distributionally-robust certificate (or prove the obstruction cleanly).</w:t>
+        <w:t>Sign the capacity covariation along the shape class U so the least-favorable result holds across F, making the renewable-cost condition a genuine distributionally-robust certificate, or prove the obstruction cleanly.</w:t>
       </w:r>
     </w:p>
     <w:p>
@@ -286,10 +213,10 @@
         <w:rPr>
           <w:b/>
         </w:rPr>
-        <w:t xml:space="preserve">Reversed-channel counterexample. </w:t>
+        <w:t xml:space="preserve">Construct the reversed-channel counterexample. </w:t>
       </w:r>
       <w:r>
-        <w:t>Construct a realized F with g increasing ⇒ K*R &lt; K°R — the sharpness example Week 1 could not produce (an algebraic sign-flip is not a realized example).</w:t>
+        <w:t>Build a realized F with g increasing so that K_R* &lt; K_R° — the sharpness example Week 1 could not produce, since an algebraic sign-flip is not a realized example.</w:t>
       </w:r>
     </w:p>
     <w:p>
@@ -303,32 +230,20 @@
         <w:t xml:space="preserve">Repair the limit-interchange. </w:t>
       </w:r>
       <w:r>
-        <w:t>Replace the E[fossil*] → 0 a.s.-corner step with a dominated-convergence / finite-K_R envelope argument.</w:t>
+        <w:t>Replace the expected-fossil-to-zero corner step with a dominated-convergence or finite-capacity envelope argument.</w:t>
       </w:r>
     </w:p>
     <w:p>
       <w:pPr>
-        <w:spacing w:before="160"/>
+        <w:spacing w:before="200"/>
       </w:pPr>
       <w:r>
         <w:rPr>
           <w:b/>
-          <w:color w:val="1F4E8C"/>
+          <w:color w:val="1F5699"/>
           <w:sz w:val="26"/>
         </w:rPr>
-        <w:t>Role 4 — Mechanism Design, Regimes &amp; Positioning</w:t>
-      </w:r>
-    </w:p>
-    <w:p>
-      <w:r>
-        <w:rPr>
-          <w:b/>
-          <w:i/>
-        </w:rPr>
-        <w:t xml:space="preserve">Mandate. </w:t>
-      </w:r>
-      <w:r>
-        <w:t>A1 mandate (3): strengthen the mechanism-design treatment (regulator as principal, utility as agent); plus regime consistency, an explicit limitations boundary, and theory positioning — so the four pieces read as one paper with no exposed flank.</w:t>
+        <w:t>Role 4 (Mechanism Design, Regimes, and Positioning)</w:t>
       </w:r>
     </w:p>
     <w:p>
@@ -339,10 +254,10 @@
         <w:rPr>
           <w:b/>
         </w:rPr>
-        <w:t xml:space="preserve">Mechanism design (principal–agent, with IR &amp; IC). </w:t>
+        <w:t xml:space="preserve">Strengthen the mechanism-design treatment. </w:t>
       </w:r>
       <w:r>
-        <w:t>Cast the regulator as principal and the utility/miner as agent; write the agent’s participation (IR) and incentive-compatibility (IC) constraints and prove the price-based program implements d* optimally and, where feasible, uniquely (not merely as the principal’s first-best dispatch); state the conditions — price-taking / exogenous R — under which IR/IC are slack and the induced miner-demand result holds — A1 mandate (3).</w:t>
+        <w:t>Cast the regulator as principal and the utility/miner as agent; write the participation and incentive-compatibility constraints and prove the price-based demand-response program implements d* optimally and, where feasible, uniquely — not merely as the principal's first-best dispatch; state the conditions (price-taking, exogenous R) under which those constraints are slack and the induced miner-demand result holds.</w:t>
       </w:r>
     </w:p>
     <w:p>
@@ -353,10 +268,10 @@
         <w:rPr>
           <w:b/>
         </w:rPr>
-        <w:t xml:space="preserve">Unify &amp; complete the regime map. </w:t>
+        <w:t xml:space="preserve">Unify and complete the regime map. </w:t>
       </w:r>
       <w:r>
-        <w:t>One Assumption 1 (R&gt;c+C_M) and one carbon decomposition (Role 1’s two-force split) everywhere; fold Role 1’s finite-optimum statement and the C_R boundedness axis into a single consistent regime theorem with the Assumption-1 necessity pattern.</w:t>
+        <w:t>Use one Assumption 1 and one carbon decomposition throughout; fold the finite-optimum statement and the renewable-cost boundedness axis into a single consistent regime theorem with the Assumption-1 necessity pattern.</w:t>
       </w:r>
     </w:p>
     <w:p>
@@ -367,10 +282,10 @@
         <w:rPr>
           <w:b/>
         </w:rPr>
-        <w:t xml:space="preserve">Limitations &amp; scope boundary. </w:t>
+        <w:t xml:space="preserve">State the limitations and scope boundary. </w:t>
       </w:r>
       <w:r>
-        <w:t>State explicitly what is assumed and what is deferred (real-data calibration → A2; reliability/welfare/social-vs-private → B1; flexibility continuum/storage/multi-grid/dynamics → B2), so no referee can reject on an unaddressed omission rather than an A1 error.</w:t>
+        <w:t>State explicitly what is assumed and what is deferred to the companion workstreams (calibration; reliability, welfare, and pricing; the flexibility continuum and dynamics), so no referee can reject on an unaddressed omission rather than an error in scope.</w:t>
       </w:r>
     </w:p>
     <w:p>
@@ -381,37 +296,15 @@
         <w:rPr>
           <w:b/>
         </w:rPr>
-        <w:t xml:space="preserve">Positioning, bibliography &amp; assembly. </w:t>
+        <w:t xml:space="preserve">Position and assemble. </w:t>
       </w:r>
       <w:r>
-        <w:t>Write the related-work section on the methods A1 uses (monotone comparative statics, interruptible/demand-response economics, distributionally-robust analysis), add the bibliography, move all “verified to 10^−k” out of proof bodies, and assemble one manuscript with a single notation table.</w:t>
-      </w:r>
-    </w:p>
-    <w:p>
-      <w:r>
-        <w:rPr>
-          <w:b/>
-        </w:rPr>
-        <w:t xml:space="preserve">Why this is complete (acceptance gate). </w:t>
-      </w:r>
-      <w:r>
-        <w:t>The four roles map one-to-one onto A1’s own four mandate items — optimal contract + necessary-and-sufficient emission condition (Role 1), numerical solver (Role 2), correlation comparative static + mining-raises-K_R (Role 3), mechanism design + miner-demand conditions (Role 4) — and additionally close every rigor gap an adversarial Management Science review raised: existence/uniqueness from primitives, a primitive (not endogenous) condition, a finite-optimum general-F theorem, single-crossing of the carbon set in C_R, a non-vacuous admissible class, comparative statics in the key prices R/β/p, an IR/IC mechanism (not just first-best dispatch), the cross-F robust certificate, the realized counterexample, the limit-interchange repair, a single consistent regime statement, an explicit limitations boundary, and literature positioning. With all of it landed there is no A1-scope angle — theory, rigor, robustness, mechanism, consistency, or positioning — left to reject on; anything beyond is, by construction, A2 or B-stream work.</w:t>
-      </w:r>
-    </w:p>
-    <w:p>
-      <w:r>
-        <w:rPr>
-          <w:b/>
-        </w:rPr>
-        <w:t xml:space="preserve">Sequencing. </w:t>
-      </w:r>
-      <w:r>
-        <w:t>All four start now and share only notation + the Week-1 closed forms. Role 1 delivers two primitives early — the primitive shift-ratio condition (unblocks Role 2’s sweep and Role 3’s class U) and the existence condition (unblocks Role 3’s covariation and Role 2’s Hessian check). Roles 2–4 hand Role 4 their final statements for assembly. Order of resolution: Role 1 (keystone) and Role 4 (mechanism + consistency) are gating; Roles 2–3 turn acceptance into a strong one.</w:t>
+        <w:t>Write the related-work section on the methods used — monotone comparative statics, interruptible and demand-response load economics, and distributionally-robust analysis — add the bibliography, and assemble the pieces into one manuscript with a single notation table.</w:t>
       </w:r>
     </w:p>
     <w:sectPr>
       <w:pgSz w:w="12240" w:h="15840"/>
-      <w:pgMar w:top="1152" w:right="1296" w:bottom="1152" w:left="1296" w:header="720" w:footer="720" w:gutter="0"/>
+      <w:pgMar w:top="1440" w:right="1440" w:bottom="1440" w:left="1440" w:header="720" w:footer="720" w:gutter="0"/>
       <w:cols w:space="720"/>
       <w:docGrid w:linePitch="360"/>
     </w:sectPr>

</xml_diff>

<commit_message>
docs: Week-2 plan now all hard load-bearing work (theory/proofs + experiments), A1 scope
Removed every soft/administrative bullet (re-scoping, documentation, limitations
prose, bibliography/positioning, assembly). Every one of the 17 bullets is now a
theorem to prove or an experiment/numerical-method to run:
- R1: existence/uniqueness+contract optimality; shift-ratio->primitive; N&S emission
  condition (general F, non-vacuous); single-crossing + viability threshold;
  sharpness (necessity) + tight magnitude bounds.
- R2: build+validate solver; carbon-sign sweep at finite optimum; Hessian certificate;
  analytic Hessian/cofactors.
- R3: correlation+price comparative statics; cross-F robust certificate; reversed-channel
  counterexample (constructed); rigorous limit-interchange.
- R4: principal-agent with IR/IC implementation; unified regime theorem (pin K_M*=K_R°);
  necessity of Assumption 1; second-best screening contract under private availability.
Week-1 format kept; 2pp.
</commit_message>
<xml_diff>
--- a/A1_deliverables/A1_Week2_NextRoles.docx
+++ b/A1_deliverables/A1_Week2_NextRoles.docx
@@ -33,10 +33,10 @@
         <w:rPr>
           <w:b/>
         </w:rPr>
-        <w:t xml:space="preserve">Establish existence, uniqueness, and the optimal contract. </w:t>
+        <w:t xml:space="preserve">Prove existence, uniqueness, and contract optimality. </w:t>
       </w:r>
       <w:r>
-        <w:t>Prove coercivity of expected profit and a primitive condition on F (e.g. a log-concave density) under which the interior capacity optimum is unique, and prove that the dispatch contract d*(x)=min{(K_F−x)_+, K_M} is the unique optimal policy via the strict R&gt;c ordering. This discharges the currently-assumed interior optimum and supplies the negative-definite-Hessian condition from primitives.</w:t>
+        <w:t>Prove expected profit is coercive and, under a primitive condition on F (e.g. a log-concave density), strictly concave on the interior region, so the capacity optimum is unique; and prove the dispatch contract d*(x)=min{(K_F−x)_+, K_M} is the unique optimal policy via the strict R&gt;c ordering. This supplies the negative-definite-Hessian condition from primitives instead of assuming it.</w:t>
       </w:r>
     </w:p>
     <w:p>
@@ -50,7 +50,7 @@
         <w:t xml:space="preserve">Promote the shift-ratio condition to a primitive. </w:t>
       </w:r>
       <w:r>
-        <w:t>Replace the endogenous-window condition g(x)=F_{K_R}/f non-increasing with a support-wide condition on F that implies it, and prove the implication.</w:t>
+        <w:t>Prove that a support-wide monotonicity of g(x)=F_{K_R}/f (or a hazard-rate condition on F) implies the endogenous-window condition the capacity channel currently relies on; give the implication with a proof.</w:t>
       </w:r>
     </w:p>
     <w:p>
@@ -64,7 +64,7 @@
         <w:t xml:space="preserve">Prove the necessary-and-sufficient emission condition for general F. </w:t>
       </w:r>
       <w:r>
-        <w:t>Under that primitive plus a tail/skew condition, prove a sharp iff for carbon reduction at a finite interior optimum, upgrading the endogenous inequality (C) and the current existence conjecture to a clean condition in primitives. Exhibit a non-power-law F satisfying all three conditions to certify the class is non-vacuous and genuinely more general than the power-law/uniform case.</w:t>
+        <w:t>Under that primitive plus a tail/skew condition, prove a sharp iff for carbon reduction at a finite interior optimum for any such F, upgrading the endogenous inequality (C) and the existence conjecture to a theorem in primitives. Exhibit a non-power-law F satisfying all conditions to prove the class non-vacuous.</w:t>
       </w:r>
     </w:p>
     <w:p>
@@ -75,10 +75,10 @@
         <w:rPr>
           <w:b/>
         </w:rPr>
-        <w:t xml:space="preserve">Complete the viability threshold. </w:t>
+        <w:t xml:space="preserve">Prove single-crossing and the viability threshold for general F. </w:t>
       </w:r>
       <w:r>
-        <w:t>Extend the renewable-cost window from the power-law family to general F, with the strict fall at a finite interior K_R* rather than the unbounded corner, and prove the carbon-reduction set is an interval (single-crossing in C_R) so carbon falls if and only if C_R is below the threshold.</w:t>
+        <w:t>Extend the renewable-cost window from the power-law family to general F and prove Δ(C_R) is single-crossing, so the carbon-reduction set is the interval {C_R &lt; C_R†} and the strict fall occurs at a finite interior K_R* rather than the unbounded corner.</w:t>
       </w:r>
     </w:p>
     <w:p>
@@ -89,10 +89,10 @@
         <w:rPr>
           <w:b/>
         </w:rPr>
-        <w:t xml:space="preserve">State the main theorem and re-scope. </w:t>
+        <w:t xml:space="preserve">Prove sharpness and tight magnitude bounds. </w:t>
       </w:r>
       <w:r>
-        <w:t>State the headline theorem, align the abstract and title to exactly what is proved, and write the economic intuition at journal quality.</w:t>
+        <w:t>Prove the shift-ratio condition is necessary as well as sufficient for K_R* &gt; K_R° (a realized boundary, not just an algebraic sign), and prove the two-sided bounds on the carbon saving Δ are tight, characterizing the carbon-reduction region in primitive parameter space.</w:t>
       </w:r>
     </w:p>
     <w:p>
@@ -116,10 +116,10 @@
         <w:rPr>
           <w:b/>
         </w:rPr>
-        <w:t xml:space="preserve">Build and document the general solver. </w:t>
+        <w:t xml:space="preserve">Build and validate the general solver. </w:t>
       </w:r>
       <w:r>
-        <w:t>Finalize the joint-capacity and dispatch solver for d*(x) and the capacities under any residual-demand distribution — the validated backend the rest of the group relies on.</w:t>
+        <w:t>Implement the joint-capacity and dispatch solver for d*(x) and (K_R,K_F,K_M) under any residual-demand distribution, and validate it against the closed forms to machine precision — the verified backend the rest of the group computes against.</w:t>
       </w:r>
     </w:p>
     <w:p>
@@ -130,10 +130,10 @@
         <w:rPr>
           <w:b/>
         </w:rPr>
-        <w:t xml:space="preserve">Deliver one carbon-sign narrative. </w:t>
+        <w:t xml:space="preserve">Run the carbon-sign sweep at a finite optimum. </w:t>
       </w:r>
       <w:r>
-        <w:t>Replace the scattered counts with a principled sweep over Role 1's primitive condition on a curated distribution family, showing carbon falls at a finite interior optimum.</w:t>
+        <w:t>Sweep over Role 1's primitive condition on a curated distribution family and show, numerically, that carbon falls at a finite interior optimum — replacing the scattered Week-1 counts with one principled map.</w:t>
       </w:r>
     </w:p>
     <w:p>
@@ -144,10 +144,10 @@
         <w:rPr>
           <w:b/>
         </w:rPr>
-        <w:t xml:space="preserve">Provide a Hessian / existence certificate. </w:t>
+        <w:t xml:space="preserve">Certify the Hessian on the interior path. </w:t>
       </w:r>
       <w:r>
-        <w:t>A reproducible check that the Hessian is negative definite on the interior path for Role 1's distribution class, backstopping existence and uniqueness.</w:t>
+        <w:t>Numerically certify the profit Hessian is negative definite along the interior equilibrium path for Role 1's distribution class, by eigenvalue computation, backstopping existence and uniqueness.</w:t>
       </w:r>
     </w:p>
     <w:p>
@@ -158,10 +158,10 @@
         <w:rPr>
           <w:b/>
         </w:rPr>
-        <w:t xml:space="preserve">Harden the solver and ship reproducibility. </w:t>
+        <w:t xml:space="preserve">Derive and implement the analytic Hessian and cofactors. </w:t>
       </w:r>
       <w:r>
-        <w:t>Replace finite-difference cofactors with analytic ones to remove the noisy knife-edge points, and ship a single command that reproduces the exact-formula checks and the carbon sweep, with documented tolerances.</w:t>
+        <w:t>Derive the full analytic Hessian and the comparative-statics cofactors (replacing finite differences, which are noisy at the knife-edge) and certify them against the solved equilibria across the class.</w:t>
       </w:r>
     </w:p>
     <w:p>
@@ -188,7 +188,7 @@
         <w:t xml:space="preserve">Prove the correlation and price comparative statics. </w:t>
       </w:r>
       <w:r>
-        <w:t>Show the net-carbon sign is governed by the demand–supply association (the shift ratio g = E[S | x]); that mining raises optimal renewable capacity K_R* &gt; K_R°; and sign the monotonicities in the computing margin R, the blackout penalty β, and the retail price p, under general conditions.</w:t>
+        <w:t>Prove the net-carbon sign is governed by the demand–supply association g = E[S | x]; that mining raises optimal renewable capacity K_R* &gt; K_R°; and sign ∂(carbon effect)/∂R, ∂/∂β, and ∂/∂p via the Hessian-cofactor identities, under general conditions.</w:t>
       </w:r>
     </w:p>
     <w:p>
@@ -199,10 +199,10 @@
         <w:rPr>
           <w:b/>
         </w:rPr>
-        <w:t xml:space="preserve">Establish the cross-distribution robust certificate. </w:t>
+        <w:t xml:space="preserve">Prove the cross-distribution robust certificate. </w:t>
       </w:r>
       <w:r>
-        <w:t>Sign the capacity covariation along the shape class U so the least-favorable result holds across F, making the renewable-cost condition a genuine distributionally-robust certificate, or prove the obstruction cleanly.</w:t>
+        <w:t>Sign the capacity covariation dK*/dF along the shape class U so the least-favorable result holds across F — making C_R ≤ C_R† ⇒ Δ ≥ 0 a genuine distributionally-robust certificate — or prove the obstruction.</w:t>
       </w:r>
     </w:p>
     <w:p>
@@ -216,7 +216,7 @@
         <w:t xml:space="preserve">Construct the reversed-channel counterexample. </w:t>
       </w:r>
       <w:r>
-        <w:t>Build a realized F with g increasing so that K_R* &lt; K_R° — the sharpness example Week 1 could not produce, since an algebraic sign-flip is not a realized example.</w:t>
+        <w:t>Build a realized distribution F with g increasing for which K_R* &lt; K_R°, demonstrating the channel reverses — the sharpness example Week 1 could not produce — and solve it numerically to confirm.</w:t>
       </w:r>
     </w:p>
     <w:p>
@@ -227,10 +227,10 @@
         <w:rPr>
           <w:b/>
         </w:rPr>
-        <w:t xml:space="preserve">Repair the limit-interchange. </w:t>
+        <w:t xml:space="preserve">Prove the limit-interchange rigorously. </w:t>
       </w:r>
       <w:r>
-        <w:t>Replace the expected-fossil-to-zero corner step with a dominated-convergence or finite-capacity envelope argument.</w:t>
+        <w:t>Replace the expected-fossil-to-zero corner step with a dominated-convergence or finite-capacity envelope argument, so the threshold proof holds without the a.s.-limit shortcut.</w:t>
       </w:r>
     </w:p>
     <w:p>
@@ -243,7 +243,7 @@
           <w:color w:val="1F5699"/>
           <w:sz w:val="26"/>
         </w:rPr>
-        <w:t>Role 4 (Mechanism Design, Regimes, and Positioning)</w:t>
+        <w:t>Role 4 (Mechanism Design and Regimes)</w:t>
       </w:r>
     </w:p>
     <w:p>
@@ -254,10 +254,10 @@
         <w:rPr>
           <w:b/>
         </w:rPr>
-        <w:t xml:space="preserve">Strengthen the mechanism-design treatment. </w:t>
+        <w:t xml:space="preserve">Prove the principal–agent implementation with IR and IC. </w:t>
       </w:r>
       <w:r>
-        <w:t>Cast the regulator as principal and the utility/miner as agent; write the participation and incentive-compatibility constraints and prove the price-based demand-response program implements d* optimally and, where feasible, uniquely — not merely as the principal's first-best dispatch; state the conditions (price-taking, exogenous R) under which those constraints are slack and the induced miner-demand result holds.</w:t>
+        <w:t>Cast the regulator as principal and the utility/miner as agent; write the participation (IR) and incentive-compatibility (IC) constraints and prove the price-based program implements d* optimally and, where feasible, uniquely — not merely as the principal's first-best dispatch — stating the price-taking / exogenous-R conditions under which IR and IC are slack.</w:t>
       </w:r>
     </w:p>
     <w:p>
@@ -268,10 +268,10 @@
         <w:rPr>
           <w:b/>
         </w:rPr>
-        <w:t xml:space="preserve">Unify and complete the regime map. </w:t>
+        <w:t xml:space="preserve">Prove the unified regime theorem. </w:t>
       </w:r>
       <w:r>
-        <w:t>Use one Assumption 1 and one carbon decomposition throughout; fold the finite-optimum statement and the renewable-cost boundedness axis into a single consistent regime theorem with the Assumption-1 necessity pattern.</w:t>
+        <w:t>Combine the C_M coverage axis (no adoption / small-FCL / interior / full coverage) and the C_R boundedness axis into one theorem, and pin down the small-FCL crossover K_M* = K_R° that Week 1 left open.</w:t>
       </w:r>
     </w:p>
     <w:p>
@@ -282,10 +282,10 @@
         <w:rPr>
           <w:b/>
         </w:rPr>
-        <w:t xml:space="preserve">State the limitations and scope boundary. </w:t>
+        <w:t xml:space="preserve">Prove the necessity of Assumption 1. </w:t>
       </w:r>
       <w:r>
-        <w:t>State explicitly what is assumed and what is deferred to the companion workstreams (calibration; reliability, welfare, and pricing; the flexibility continuum and dynamics), so no referee can reject on an unaddressed omission rather than an error in scope.</w:t>
+        <w:t>For each of the four parameter conditions, prove it is necessary for the interior optimum or the economic sign it guards, and characterize the regime obtained when it is relaxed (full-coverage corner, no adoption, or a perverse curtailment).</w:t>
       </w:r>
     </w:p>
     <w:p>
@@ -296,10 +296,10 @@
         <w:rPr>
           <w:b/>
         </w:rPr>
-        <w:t xml:space="preserve">Position and assemble. </w:t>
+        <w:t xml:space="preserve">Characterize the second-best contract under private information. </w:t>
       </w:r>
       <w:r>
-        <w:t>Write the related-work section on the methods used — monotone comparative statics, interruptible and demand-response load economics, and distributionally-robust analysis — add the bibliography, and assemble the pieces into one manuscript with a single notation table.</w:t>
+        <w:t>When the agent privately observes its availability a(x)=(K_F−x)_+, derive the optimal screening contract (the second-best d*) and characterize how the resulting information rent changes the emission outcome versus the full-information benchmark.</w:t>
       </w:r>
     </w:p>
     <w:sectPr>

</xml_diff>